<commit_message>
Fix heading hierarchy in homework_exporter by setting teacher answer section to Heading 2
</commit_message>
<xml_diff>
--- a/agent soạn tài liệu/output/bai3_noi_nang_nhiet_luong/ready/bai3_noi_nang_nhiet_luong_bai_tap_ve_nha.docx
+++ b/agent soạn tài liệu/output/bai3_noi_nang_nhiet_luong/ready/bai3_noi_nang_nhiet_luong_bai_tap_ve_nha.docx
@@ -6351,15 +6351,14 @@
     </w:p>
     <w:p>
       <w:pPr>
-        <w:spacing w:before="360" w:after="160"/>
-        <w:jc w:val="center"/>
+        <w:spacing w:before="280" w:after="120"/>
       </w:pPr>
       <w:r>
         <w:rPr>
           <w:rFonts w:ascii="Times New Roman" w:hAnsi="Times New Roman"/>
           <w:b/>
           <w:color w:val="1E3A5F"/>
-          <w:sz w:val="32"/>
+          <w:sz w:val="28"/>
         </w:rPr>
         <w:t>ĐÁP ÁN CHO GIÁO VIÊN</w:t>
       </w:r>

</xml_diff>

<commit_message>
Implement Markdown *italic* parser and convert asterisk multiplication operator to proper symbols
</commit_message>
<xml_diff>
--- a/agent soạn tài liệu/output/bai3_noi_nang_nhiet_luong/ready/bai3_noi_nang_nhiet_luong_bai_tap_ve_nha.docx
+++ b/agent soạn tài liệu/output/bai3_noi_nang_nhiet_luong/ready/bai3_noi_nang_nhiet_luong_bai_tap_ve_nha.docx
@@ -161,11 +161,11 @@
         <w:rPr>
           <w:rFonts w:ascii="Times New Roman" w:hAnsi="Times New Roman"/>
           <w:b w:val="0"/>
-          <w:i w:val="0"/>
+          <w:i/>
           <w:color w:val="000000"/>
           <w:sz w:val="22"/>
         </w:rPr>
-        <w:t>*Mỗi câu hỏi chỉ chọn một phương án trả lời đúng.*</w:t>
+        <w:t>Mỗi câu hỏi chỉ chọn một phương án trả lời đúng.</w:t>
       </w:r>
     </w:p>
     <w:p>
@@ -1155,6 +1155,7 @@
             <w:r>
               <w:rPr>
                 <w:rFonts w:ascii="Times New Roman" w:hAnsi="Times New Roman"/>
+                <w:b w:val="0"/>
                 <w:i/>
                 <w:color w:val="000000"/>
                 <w:sz w:val="22"/>
@@ -1207,6 +1208,7 @@
             <w:r>
               <w:rPr>
                 <w:rFonts w:ascii="Times New Roman" w:hAnsi="Times New Roman"/>
+                <w:b w:val="0"/>
                 <w:i/>
                 <w:color w:val="000000"/>
                 <w:sz w:val="22"/>
@@ -1265,6 +1267,7 @@
             <w:r>
               <w:rPr>
                 <w:rFonts w:ascii="Times New Roman" w:hAnsi="Times New Roman"/>
+                <w:b w:val="0"/>
                 <w:i/>
                 <w:color w:val="000000"/>
                 <w:sz w:val="22"/>
@@ -1317,6 +1320,7 @@
             <w:r>
               <w:rPr>
                 <w:rFonts w:ascii="Times New Roman" w:hAnsi="Times New Roman"/>
+                <w:b w:val="0"/>
                 <w:i/>
                 <w:color w:val="000000"/>
                 <w:sz w:val="22"/>
@@ -1415,6 +1419,7 @@
             <w:r>
               <w:rPr>
                 <w:rFonts w:ascii="Times New Roman" w:hAnsi="Times New Roman"/>
+                <w:b w:val="0"/>
                 <w:i/>
                 <w:color w:val="000000"/>
                 <w:sz w:val="22"/>
@@ -1434,6 +1439,7 @@
             <w:r>
               <w:rPr>
                 <w:rFonts w:ascii="Times New Roman" w:hAnsi="Times New Roman"/>
+                <w:b w:val="0"/>
                 <w:i/>
                 <w:color w:val="000000"/>
                 <w:sz w:val="22"/>
@@ -1486,6 +1492,7 @@
             <w:r>
               <w:rPr>
                 <w:rFonts w:ascii="Times New Roman" w:hAnsi="Times New Roman"/>
+                <w:b w:val="0"/>
                 <w:i/>
                 <w:color w:val="000000"/>
                 <w:sz w:val="22"/>
@@ -1505,6 +1512,7 @@
             <w:r>
               <w:rPr>
                 <w:rFonts w:ascii="Times New Roman" w:hAnsi="Times New Roman"/>
+                <w:b w:val="0"/>
                 <w:i/>
                 <w:color w:val="000000"/>
                 <w:sz w:val="22"/>
@@ -1563,6 +1571,7 @@
             <w:r>
               <w:rPr>
                 <w:rFonts w:ascii="Times New Roman" w:hAnsi="Times New Roman"/>
+                <w:b w:val="0"/>
                 <w:i/>
                 <w:color w:val="000000"/>
                 <w:sz w:val="22"/>
@@ -1582,6 +1591,7 @@
             <w:r>
               <w:rPr>
                 <w:rFonts w:ascii="Times New Roman" w:hAnsi="Times New Roman"/>
+                <w:b w:val="0"/>
                 <w:i/>
                 <w:color w:val="000000"/>
                 <w:sz w:val="22"/>
@@ -1634,6 +1644,7 @@
             <w:r>
               <w:rPr>
                 <w:rFonts w:ascii="Times New Roman" w:hAnsi="Times New Roman"/>
+                <w:b w:val="0"/>
                 <w:i/>
                 <w:color w:val="000000"/>
                 <w:sz w:val="22"/>
@@ -1653,6 +1664,7 @@
             <w:r>
               <w:rPr>
                 <w:rFonts w:ascii="Times New Roman" w:hAnsi="Times New Roman"/>
+                <w:b w:val="0"/>
                 <w:i/>
                 <w:color w:val="000000"/>
                 <w:sz w:val="22"/>
@@ -1975,6 +1987,7 @@
             <w:r>
               <w:rPr>
                 <w:rFonts w:ascii="Times New Roman" w:hAnsi="Times New Roman"/>
+                <w:b w:val="0"/>
                 <w:i/>
                 <w:color w:val="000000"/>
                 <w:sz w:val="22"/>
@@ -1994,6 +2007,7 @@
             <w:r>
               <w:rPr>
                 <w:rFonts w:ascii="Times New Roman" w:hAnsi="Times New Roman"/>
+                <w:b w:val="0"/>
                 <w:i/>
                 <w:color w:val="000000"/>
                 <w:sz w:val="22"/>
@@ -2046,6 +2060,7 @@
             <w:r>
               <w:rPr>
                 <w:rFonts w:ascii="Times New Roman" w:hAnsi="Times New Roman"/>
+                <w:b w:val="0"/>
                 <w:i/>
                 <w:color w:val="000000"/>
                 <w:sz w:val="22"/>
@@ -2065,6 +2080,7 @@
             <w:r>
               <w:rPr>
                 <w:rFonts w:ascii="Times New Roman" w:hAnsi="Times New Roman"/>
+                <w:b w:val="0"/>
                 <w:i/>
                 <w:color w:val="000000"/>
                 <w:sz w:val="22"/>
@@ -2123,6 +2139,7 @@
             <w:r>
               <w:rPr>
                 <w:rFonts w:ascii="Times New Roman" w:hAnsi="Times New Roman"/>
+                <w:b w:val="0"/>
                 <w:i/>
                 <w:color w:val="000000"/>
                 <w:sz w:val="22"/>
@@ -2142,6 +2159,7 @@
             <w:r>
               <w:rPr>
                 <w:rFonts w:ascii="Times New Roman" w:hAnsi="Times New Roman"/>
+                <w:b w:val="0"/>
                 <w:i/>
                 <w:color w:val="000000"/>
                 <w:sz w:val="22"/>
@@ -2194,6 +2212,7 @@
             <w:r>
               <w:rPr>
                 <w:rFonts w:ascii="Times New Roman" w:hAnsi="Times New Roman"/>
+                <w:b w:val="0"/>
                 <w:i/>
                 <w:color w:val="000000"/>
                 <w:sz w:val="22"/>
@@ -2213,6 +2232,7 @@
             <w:r>
               <w:rPr>
                 <w:rFonts w:ascii="Times New Roman" w:hAnsi="Times New Roman"/>
+                <w:b w:val="0"/>
                 <w:i/>
                 <w:color w:val="000000"/>
                 <w:sz w:val="22"/>
@@ -2263,6 +2283,7 @@
       <w:r>
         <w:rPr>
           <w:rFonts w:ascii="Times New Roman" w:hAnsi="Times New Roman"/>
+          <w:b w:val="0"/>
           <w:i/>
           <w:color w:val="000000"/>
           <w:sz w:val="26"/>
@@ -2282,6 +2303,7 @@
       <w:r>
         <w:rPr>
           <w:rFonts w:ascii="Times New Roman" w:hAnsi="Times New Roman"/>
+          <w:b w:val="0"/>
           <w:i/>
           <w:color w:val="000000"/>
           <w:sz w:val="26"/>
@@ -2301,6 +2323,7 @@
       <w:r>
         <w:rPr>
           <w:rFonts w:ascii="Times New Roman" w:hAnsi="Times New Roman"/>
+          <w:b w:val="0"/>
           <w:i/>
           <w:color w:val="000000"/>
           <w:sz w:val="26"/>
@@ -2368,6 +2391,7 @@
             <w:r>
               <w:rPr>
                 <w:rFonts w:ascii="Times New Roman" w:hAnsi="Times New Roman"/>
+                <w:b w:val="0"/>
                 <w:i/>
                 <w:color w:val="000000"/>
                 <w:sz w:val="22"/>
@@ -2420,6 +2444,7 @@
             <w:r>
               <w:rPr>
                 <w:rFonts w:ascii="Times New Roman" w:hAnsi="Times New Roman"/>
+                <w:b w:val="0"/>
                 <w:i/>
                 <w:color w:val="000000"/>
                 <w:sz w:val="22"/>
@@ -2478,6 +2503,7 @@
             <w:r>
               <w:rPr>
                 <w:rFonts w:ascii="Times New Roman" w:hAnsi="Times New Roman"/>
+                <w:b w:val="0"/>
                 <w:i/>
                 <w:color w:val="000000"/>
                 <w:sz w:val="22"/>
@@ -2530,6 +2556,7 @@
             <w:r>
               <w:rPr>
                 <w:rFonts w:ascii="Times New Roman" w:hAnsi="Times New Roman"/>
+                <w:b w:val="0"/>
                 <w:i/>
                 <w:color w:val="000000"/>
                 <w:sz w:val="22"/>
@@ -2630,6 +2657,7 @@
             <w:r>
               <w:rPr>
                 <w:rFonts w:ascii="Times New Roman" w:hAnsi="Times New Roman"/>
+                <w:b w:val="0"/>
                 <w:i/>
                 <w:color w:val="000000"/>
                 <w:sz w:val="22"/>
@@ -2682,6 +2710,7 @@
             <w:r>
               <w:rPr>
                 <w:rFonts w:ascii="Times New Roman" w:hAnsi="Times New Roman"/>
+                <w:b w:val="0"/>
                 <w:i/>
                 <w:color w:val="000000"/>
                 <w:sz w:val="22"/>
@@ -2734,6 +2763,7 @@
             <w:r>
               <w:rPr>
                 <w:rFonts w:ascii="Times New Roman" w:hAnsi="Times New Roman"/>
+                <w:b w:val="0"/>
                 <w:i/>
                 <w:color w:val="000000"/>
                 <w:sz w:val="22"/>
@@ -2786,6 +2816,7 @@
             <w:r>
               <w:rPr>
                 <w:rFonts w:ascii="Times New Roman" w:hAnsi="Times New Roman"/>
+                <w:b w:val="0"/>
                 <w:i/>
                 <w:color w:val="000000"/>
                 <w:sz w:val="22"/>
@@ -2836,6 +2867,7 @@
       <w:r>
         <w:rPr>
           <w:rFonts w:ascii="Times New Roman" w:hAnsi="Times New Roman"/>
+          <w:b w:val="0"/>
           <w:i/>
           <w:color w:val="000000"/>
           <w:sz w:val="26"/>
@@ -2855,6 +2887,7 @@
       <w:r>
         <w:rPr>
           <w:rFonts w:ascii="Times New Roman" w:hAnsi="Times New Roman"/>
+          <w:b w:val="0"/>
           <w:i/>
           <w:color w:val="000000"/>
           <w:sz w:val="26"/>
@@ -2874,6 +2907,7 @@
       <w:r>
         <w:rPr>
           <w:rFonts w:ascii="Times New Roman" w:hAnsi="Times New Roman"/>
+          <w:b w:val="0"/>
           <w:i/>
           <w:color w:val="000000"/>
           <w:sz w:val="26"/>
@@ -2893,6 +2927,7 @@
       <w:r>
         <w:rPr>
           <w:rFonts w:ascii="Times New Roman" w:hAnsi="Times New Roman"/>
+          <w:b w:val="0"/>
           <w:i/>
           <w:color w:val="000000"/>
           <w:sz w:val="26"/>
@@ -2960,6 +2995,7 @@
             <w:r>
               <w:rPr>
                 <w:rFonts w:ascii="Times New Roman" w:hAnsi="Times New Roman"/>
+                <w:b w:val="0"/>
                 <w:i/>
                 <w:color w:val="000000"/>
                 <w:sz w:val="22"/>
@@ -3012,6 +3048,7 @@
             <w:r>
               <w:rPr>
                 <w:rFonts w:ascii="Times New Roman" w:hAnsi="Times New Roman"/>
+                <w:b w:val="0"/>
                 <w:i/>
                 <w:color w:val="000000"/>
                 <w:sz w:val="22"/>
@@ -3070,6 +3107,7 @@
             <w:r>
               <w:rPr>
                 <w:rFonts w:ascii="Times New Roman" w:hAnsi="Times New Roman"/>
+                <w:b w:val="0"/>
                 <w:i/>
                 <w:color w:val="000000"/>
                 <w:sz w:val="22"/>
@@ -3122,6 +3160,7 @@
             <w:r>
               <w:rPr>
                 <w:rFonts w:ascii="Times New Roman" w:hAnsi="Times New Roman"/>
+                <w:b w:val="0"/>
                 <w:i/>
                 <w:color w:val="000000"/>
                 <w:sz w:val="22"/>
@@ -3172,6 +3211,7 @@
       <w:r>
         <w:rPr>
           <w:rFonts w:ascii="Times New Roman" w:hAnsi="Times New Roman"/>
+          <w:b w:val="0"/>
           <w:i/>
           <w:color w:val="000000"/>
           <w:sz w:val="26"/>
@@ -3191,6 +3231,7 @@
       <w:r>
         <w:rPr>
           <w:rFonts w:ascii="Times New Roman" w:hAnsi="Times New Roman"/>
+          <w:b w:val="0"/>
           <w:i/>
           <w:color w:val="000000"/>
           <w:sz w:val="26"/>
@@ -3268,6 +3309,7 @@
             <w:r>
               <w:rPr>
                 <w:rFonts w:ascii="Times New Roman" w:hAnsi="Times New Roman"/>
+                <w:b w:val="0"/>
                 <w:i/>
                 <w:color w:val="000000"/>
                 <w:sz w:val="22"/>
@@ -3330,6 +3372,7 @@
             <w:r>
               <w:rPr>
                 <w:rFonts w:ascii="Times New Roman" w:hAnsi="Times New Roman"/>
+                <w:b w:val="0"/>
                 <w:i/>
                 <w:color w:val="000000"/>
                 <w:sz w:val="22"/>
@@ -3398,6 +3441,7 @@
             <w:r>
               <w:rPr>
                 <w:rFonts w:ascii="Times New Roman" w:hAnsi="Times New Roman"/>
+                <w:b w:val="0"/>
                 <w:i/>
                 <w:color w:val="000000"/>
                 <w:sz w:val="22"/>
@@ -3460,6 +3504,7 @@
             <w:r>
               <w:rPr>
                 <w:rFonts w:ascii="Times New Roman" w:hAnsi="Times New Roman"/>
+                <w:b w:val="0"/>
                 <w:i/>
                 <w:color w:val="000000"/>
                 <w:sz w:val="22"/>
@@ -3510,6 +3555,7 @@
       <w:r>
         <w:rPr>
           <w:rFonts w:ascii="Times New Roman" w:hAnsi="Times New Roman"/>
+          <w:b w:val="0"/>
           <w:i/>
           <w:color w:val="000000"/>
           <w:sz w:val="26"/>
@@ -3529,6 +3575,7 @@
       <w:r>
         <w:rPr>
           <w:rFonts w:ascii="Times New Roman" w:hAnsi="Times New Roman"/>
+          <w:b w:val="0"/>
           <w:i/>
           <w:color w:val="000000"/>
           <w:sz w:val="26"/>
@@ -3606,6 +3653,7 @@
             <w:r>
               <w:rPr>
                 <w:rFonts w:ascii="Times New Roman" w:hAnsi="Times New Roman"/>
+                <w:b w:val="0"/>
                 <w:i/>
                 <w:color w:val="000000"/>
                 <w:sz w:val="22"/>
@@ -3668,6 +3716,7 @@
             <w:r>
               <w:rPr>
                 <w:rFonts w:ascii="Times New Roman" w:hAnsi="Times New Roman"/>
+                <w:b w:val="0"/>
                 <w:i/>
                 <w:color w:val="000000"/>
                 <w:sz w:val="22"/>
@@ -3736,6 +3785,7 @@
             <w:r>
               <w:rPr>
                 <w:rFonts w:ascii="Times New Roman" w:hAnsi="Times New Roman"/>
+                <w:b w:val="0"/>
                 <w:i/>
                 <w:color w:val="000000"/>
                 <w:sz w:val="22"/>
@@ -3798,6 +3848,7 @@
             <w:r>
               <w:rPr>
                 <w:rFonts w:ascii="Times New Roman" w:hAnsi="Times New Roman"/>
+                <w:b w:val="0"/>
                 <w:i/>
                 <w:color w:val="000000"/>
                 <w:sz w:val="22"/>
@@ -3848,6 +3899,7 @@
       <w:r>
         <w:rPr>
           <w:rFonts w:ascii="Times New Roman" w:hAnsi="Times New Roman"/>
+          <w:b w:val="0"/>
           <w:i/>
           <w:color w:val="000000"/>
           <w:sz w:val="26"/>
@@ -3867,6 +3919,7 @@
       <w:r>
         <w:rPr>
           <w:rFonts w:ascii="Times New Roman" w:hAnsi="Times New Roman"/>
+          <w:b w:val="0"/>
           <w:i/>
           <w:color w:val="000000"/>
           <w:sz w:val="26"/>
@@ -3886,6 +3939,7 @@
       <w:r>
         <w:rPr>
           <w:rFonts w:ascii="Times New Roman" w:hAnsi="Times New Roman"/>
+          <w:b w:val="0"/>
           <w:i/>
           <w:color w:val="000000"/>
           <w:sz w:val="26"/>
@@ -3905,6 +3959,7 @@
       <w:r>
         <w:rPr>
           <w:rFonts w:ascii="Times New Roman" w:hAnsi="Times New Roman"/>
+          <w:b w:val="0"/>
           <w:i/>
           <w:color w:val="000000"/>
           <w:sz w:val="26"/>
@@ -3924,6 +3979,7 @@
       <w:r>
         <w:rPr>
           <w:rFonts w:ascii="Times New Roman" w:hAnsi="Times New Roman"/>
+          <w:b w:val="0"/>
           <w:i/>
           <w:color w:val="000000"/>
           <w:sz w:val="26"/>
@@ -3993,6 +4049,7 @@
             <w:r>
               <w:rPr>
                 <w:rFonts w:ascii="Times New Roman" w:hAnsi="Times New Roman"/>
+                <w:b w:val="0"/>
                 <w:i/>
                 <w:color w:val="000000"/>
                 <w:sz w:val="22"/>
@@ -4045,6 +4102,7 @@
             <w:r>
               <w:rPr>
                 <w:rFonts w:ascii="Times New Roman" w:hAnsi="Times New Roman"/>
+                <w:b w:val="0"/>
                 <w:i/>
                 <w:color w:val="000000"/>
                 <w:sz w:val="22"/>
@@ -4097,6 +4155,7 @@
             <w:r>
               <w:rPr>
                 <w:rFonts w:ascii="Times New Roman" w:hAnsi="Times New Roman"/>
+                <w:b w:val="0"/>
                 <w:i/>
                 <w:color w:val="000000"/>
                 <w:sz w:val="22"/>
@@ -4149,6 +4208,7 @@
             <w:r>
               <w:rPr>
                 <w:rFonts w:ascii="Times New Roman" w:hAnsi="Times New Roman"/>
+                <w:b w:val="0"/>
                 <w:i/>
                 <w:color w:val="000000"/>
                 <w:sz w:val="22"/>
@@ -4199,6 +4259,7 @@
       <w:r>
         <w:rPr>
           <w:rFonts w:ascii="Times New Roman" w:hAnsi="Times New Roman"/>
+          <w:b w:val="0"/>
           <w:i/>
           <w:color w:val="000000"/>
           <w:sz w:val="26"/>
@@ -4268,6 +4329,7 @@
             <w:r>
               <w:rPr>
                 <w:rFonts w:ascii="Times New Roman" w:hAnsi="Times New Roman"/>
+                <w:b w:val="0"/>
                 <w:i/>
                 <w:color w:val="000000"/>
                 <w:sz w:val="22"/>
@@ -4320,6 +4382,7 @@
             <w:r>
               <w:rPr>
                 <w:rFonts w:ascii="Times New Roman" w:hAnsi="Times New Roman"/>
+                <w:b w:val="0"/>
                 <w:i/>
                 <w:color w:val="000000"/>
                 <w:sz w:val="22"/>
@@ -4372,6 +4435,7 @@
             <w:r>
               <w:rPr>
                 <w:rFonts w:ascii="Times New Roman" w:hAnsi="Times New Roman"/>
+                <w:b w:val="0"/>
                 <w:i/>
                 <w:color w:val="000000"/>
                 <w:sz w:val="22"/>
@@ -4424,6 +4488,7 @@
             <w:r>
               <w:rPr>
                 <w:rFonts w:ascii="Times New Roman" w:hAnsi="Times New Roman"/>
+                <w:b w:val="0"/>
                 <w:i/>
                 <w:color w:val="000000"/>
                 <w:sz w:val="22"/>
@@ -4474,6 +4539,7 @@
       <w:r>
         <w:rPr>
           <w:rFonts w:ascii="Times New Roman" w:hAnsi="Times New Roman"/>
+          <w:b w:val="0"/>
           <w:i/>
           <w:color w:val="000000"/>
           <w:sz w:val="26"/>
@@ -4493,6 +4559,7 @@
       <w:r>
         <w:rPr>
           <w:rFonts w:ascii="Times New Roman" w:hAnsi="Times New Roman"/>
+          <w:b w:val="0"/>
           <w:i/>
           <w:color w:val="000000"/>
           <w:sz w:val="26"/>
@@ -4804,6 +4871,7 @@
             <w:r>
               <w:rPr>
                 <w:rFonts w:ascii="Times New Roman" w:hAnsi="Times New Roman"/>
+                <w:b w:val="0"/>
                 <w:i/>
                 <w:color w:val="000000"/>
                 <w:sz w:val="22"/>
@@ -4823,6 +4891,7 @@
             <w:r>
               <w:rPr>
                 <w:rFonts w:ascii="Times New Roman" w:hAnsi="Times New Roman"/>
+                <w:b w:val="0"/>
                 <w:i/>
                 <w:color w:val="000000"/>
                 <w:sz w:val="22"/>
@@ -5037,6 +5106,7 @@
       <w:r>
         <w:rPr>
           <w:rFonts w:ascii="Times New Roman" w:hAnsi="Times New Roman"/>
+          <w:b w:val="0"/>
           <w:i/>
           <w:color w:val="000000"/>
           <w:sz w:val="26"/>
@@ -5056,6 +5126,7 @@
       <w:r>
         <w:rPr>
           <w:rFonts w:ascii="Times New Roman" w:hAnsi="Times New Roman"/>
+          <w:b w:val="0"/>
           <w:i/>
           <w:color w:val="000000"/>
           <w:sz w:val="26"/>
@@ -5075,6 +5146,7 @@
       <w:r>
         <w:rPr>
           <w:rFonts w:ascii="Times New Roman" w:hAnsi="Times New Roman"/>
+          <w:b w:val="0"/>
           <w:i/>
           <w:color w:val="000000"/>
           <w:sz w:val="26"/>
@@ -5142,6 +5214,7 @@
             <w:r>
               <w:rPr>
                 <w:rFonts w:ascii="Times New Roman" w:hAnsi="Times New Roman"/>
+                <w:b w:val="0"/>
                 <w:i/>
                 <w:color w:val="000000"/>
                 <w:sz w:val="22"/>
@@ -5194,6 +5267,7 @@
             <w:r>
               <w:rPr>
                 <w:rFonts w:ascii="Times New Roman" w:hAnsi="Times New Roman"/>
+                <w:b w:val="0"/>
                 <w:i/>
                 <w:color w:val="000000"/>
                 <w:sz w:val="22"/>
@@ -5252,6 +5326,7 @@
             <w:r>
               <w:rPr>
                 <w:rFonts w:ascii="Times New Roman" w:hAnsi="Times New Roman"/>
+                <w:b w:val="0"/>
                 <w:i/>
                 <w:color w:val="000000"/>
                 <w:sz w:val="22"/>
@@ -5304,6 +5379,7 @@
             <w:r>
               <w:rPr>
                 <w:rFonts w:ascii="Times New Roman" w:hAnsi="Times New Roman"/>
+                <w:b w:val="0"/>
                 <w:i/>
                 <w:color w:val="000000"/>
                 <w:sz w:val="22"/>
@@ -5644,6 +5720,7 @@
             <w:r>
               <w:rPr>
                 <w:rFonts w:ascii="Times New Roman" w:hAnsi="Times New Roman"/>
+                <w:b w:val="0"/>
                 <w:i/>
                 <w:color w:val="000000"/>
                 <w:sz w:val="22"/>
@@ -5663,6 +5740,7 @@
             <w:r>
               <w:rPr>
                 <w:rFonts w:ascii="Times New Roman" w:hAnsi="Times New Roman"/>
+                <w:b w:val="0"/>
                 <w:i/>
                 <w:color w:val="000000"/>
                 <w:sz w:val="22"/>
@@ -5793,6 +5871,7 @@
             <w:r>
               <w:rPr>
                 <w:rFonts w:ascii="Times New Roman" w:hAnsi="Times New Roman"/>
+                <w:b w:val="0"/>
                 <w:i/>
                 <w:color w:val="000000"/>
                 <w:sz w:val="22"/>
@@ -5812,6 +5891,7 @@
             <w:r>
               <w:rPr>
                 <w:rFonts w:ascii="Times New Roman" w:hAnsi="Times New Roman"/>
+                <w:b w:val="0"/>
                 <w:i/>
                 <w:color w:val="000000"/>
                 <w:sz w:val="22"/>
@@ -5831,6 +5911,7 @@
             <w:r>
               <w:rPr>
                 <w:rFonts w:ascii="Times New Roman" w:hAnsi="Times New Roman"/>
+                <w:b w:val="0"/>
                 <w:i/>
                 <w:color w:val="000000"/>
                 <w:sz w:val="22"/>
@@ -6439,6 +6520,7 @@
             <w:r>
               <w:rPr>
                 <w:rFonts w:ascii="Times New Roman" w:hAnsi="Times New Roman"/>
+                <w:b w:val="0"/>
                 <w:i/>
                 <w:color w:val="000000"/>
                 <w:sz w:val="22"/>
@@ -6458,6 +6540,7 @@
             <w:r>
               <w:rPr>
                 <w:rFonts w:ascii="Times New Roman" w:hAnsi="Times New Roman"/>
+                <w:b w:val="0"/>
                 <w:i/>
                 <w:color w:val="000000"/>
                 <w:sz w:val="22"/>
@@ -6477,6 +6560,7 @@
             <w:r>
               <w:rPr>
                 <w:rFonts w:ascii="Times New Roman" w:hAnsi="Times New Roman"/>
+                <w:b w:val="0"/>
                 <w:i/>
                 <w:color w:val="000000"/>
                 <w:sz w:val="22"/>
@@ -6496,6 +6580,7 @@
             <w:r>
               <w:rPr>
                 <w:rFonts w:ascii="Times New Roman" w:hAnsi="Times New Roman"/>
+                <w:b w:val="0"/>
                 <w:i/>
                 <w:color w:val="000000"/>
                 <w:sz w:val="22"/>
@@ -6721,6 +6806,7 @@
       <w:r>
         <w:rPr>
           <w:rFonts w:ascii="Times New Roman" w:hAnsi="Times New Roman"/>
+          <w:b w:val="0"/>
           <w:i/>
           <w:color w:val="000000"/>
           <w:sz w:val="26"/>
@@ -6740,6 +6826,7 @@
       <w:r>
         <w:rPr>
           <w:rFonts w:ascii="Times New Roman" w:hAnsi="Times New Roman"/>
+          <w:b w:val="0"/>
           <w:i/>
           <w:color w:val="000000"/>
           <w:sz w:val="26"/>
@@ -6920,6 +7007,7 @@
             <w:r>
               <w:rPr>
                 <w:rFonts w:ascii="Times New Roman" w:hAnsi="Times New Roman"/>
+                <w:b w:val="0"/>
                 <w:i/>
                 <w:color w:val="000000"/>
                 <w:sz w:val="22"/>
@@ -7050,6 +7138,7 @@
             <w:r>
               <w:rPr>
                 <w:rFonts w:ascii="Times New Roman" w:hAnsi="Times New Roman"/>
+                <w:b w:val="0"/>
                 <w:i/>
                 <w:color w:val="000000"/>
                 <w:sz w:val="22"/>
@@ -7180,6 +7269,7 @@
             <w:r>
               <w:rPr>
                 <w:rFonts w:ascii="Times New Roman" w:hAnsi="Times New Roman"/>
+                <w:b w:val="0"/>
                 <w:i/>
                 <w:color w:val="000000"/>
                 <w:sz w:val="22"/>
@@ -7405,6 +7495,7 @@
       <w:r>
         <w:rPr>
           <w:rFonts w:ascii="Times New Roman" w:hAnsi="Times New Roman"/>
+          <w:b w:val="0"/>
           <w:i/>
           <w:color w:val="000000"/>
           <w:sz w:val="26"/>
@@ -7696,6 +7787,7 @@
             <w:r>
               <w:rPr>
                 <w:rFonts w:ascii="Times New Roman" w:hAnsi="Times New Roman"/>
+                <w:b w:val="0"/>
                 <w:i/>
                 <w:color w:val="000000"/>
                 <w:sz w:val="22"/>
@@ -7715,6 +7807,7 @@
             <w:r>
               <w:rPr>
                 <w:rFonts w:ascii="Times New Roman" w:hAnsi="Times New Roman"/>
+                <w:b w:val="0"/>
                 <w:i/>
                 <w:color w:val="000000"/>
                 <w:sz w:val="22"/>
@@ -7734,6 +7827,7 @@
             <w:r>
               <w:rPr>
                 <w:rFonts w:ascii="Times New Roman" w:hAnsi="Times New Roman"/>
+                <w:b w:val="0"/>
                 <w:i/>
                 <w:color w:val="000000"/>
                 <w:sz w:val="22"/>
@@ -7864,6 +7958,7 @@
             <w:r>
               <w:rPr>
                 <w:rFonts w:ascii="Times New Roman" w:hAnsi="Times New Roman"/>
+                <w:b w:val="0"/>
                 <w:i/>
                 <w:color w:val="000000"/>
                 <w:sz w:val="22"/>
@@ -7883,6 +7978,7 @@
             <w:r>
               <w:rPr>
                 <w:rFonts w:ascii="Times New Roman" w:hAnsi="Times New Roman"/>
+                <w:b w:val="0"/>
                 <w:i/>
                 <w:color w:val="000000"/>
                 <w:sz w:val="22"/>
@@ -8126,6 +8222,7 @@
       <w:r>
         <w:rPr>
           <w:rFonts w:ascii="Times New Roman" w:hAnsi="Times New Roman"/>
+          <w:b w:val="0"/>
           <w:i/>
           <w:color w:val="000000"/>
           <w:sz w:val="26"/>
@@ -8145,6 +8242,7 @@
       <w:r>
         <w:rPr>
           <w:rFonts w:ascii="Times New Roman" w:hAnsi="Times New Roman"/>
+          <w:b w:val="0"/>
           <w:i/>
           <w:color w:val="000000"/>
           <w:sz w:val="26"/>
@@ -8207,6 +8305,7 @@
       <w:r>
         <w:rPr>
           <w:rFonts w:ascii="Times New Roman" w:hAnsi="Times New Roman"/>
+          <w:b w:val="0"/>
           <w:i/>
           <w:color w:val="000000"/>
           <w:sz w:val="26"/>
@@ -8226,6 +8325,7 @@
       <w:r>
         <w:rPr>
           <w:rFonts w:ascii="Times New Roman" w:hAnsi="Times New Roman"/>
+          <w:b w:val="0"/>
           <w:i/>
           <w:color w:val="000000"/>
           <w:sz w:val="26"/>
@@ -8288,6 +8388,7 @@
       <w:r>
         <w:rPr>
           <w:rFonts w:ascii="Times New Roman" w:hAnsi="Times New Roman"/>
+          <w:b w:val="0"/>
           <w:i/>
           <w:color w:val="000000"/>
           <w:sz w:val="26"/>
@@ -8307,6 +8408,7 @@
       <w:r>
         <w:rPr>
           <w:rFonts w:ascii="Times New Roman" w:hAnsi="Times New Roman"/>
+          <w:b w:val="0"/>
           <w:i/>
           <w:color w:val="000000"/>
           <w:sz w:val="26"/>
@@ -8326,6 +8428,7 @@
       <w:r>
         <w:rPr>
           <w:rFonts w:ascii="Times New Roman" w:hAnsi="Times New Roman"/>
+          <w:b w:val="0"/>
           <w:i/>
           <w:color w:val="000000"/>
           <w:sz w:val="26"/>
@@ -8345,6 +8448,7 @@
       <w:r>
         <w:rPr>
           <w:rFonts w:ascii="Times New Roman" w:hAnsi="Times New Roman"/>
+          <w:b w:val="0"/>
           <w:i/>
           <w:color w:val="000000"/>
           <w:sz w:val="26"/>
@@ -8407,6 +8511,7 @@
       <w:r>
         <w:rPr>
           <w:rFonts w:ascii="Times New Roman" w:hAnsi="Times New Roman"/>
+          <w:b w:val="0"/>
           <w:i/>
           <w:color w:val="000000"/>
           <w:sz w:val="26"/>
@@ -8426,6 +8531,7 @@
       <w:r>
         <w:rPr>
           <w:rFonts w:ascii="Times New Roman" w:hAnsi="Times New Roman"/>
+          <w:b w:val="0"/>
           <w:i/>
           <w:color w:val="000000"/>
           <w:sz w:val="26"/>
@@ -8488,6 +8594,7 @@
       <w:r>
         <w:rPr>
           <w:rFonts w:ascii="Times New Roman" w:hAnsi="Times New Roman"/>
+          <w:b w:val="0"/>
           <w:i/>
           <w:color w:val="000000"/>
           <w:sz w:val="26"/>
@@ -8507,6 +8614,7 @@
       <w:r>
         <w:rPr>
           <w:rFonts w:ascii="Times New Roman" w:hAnsi="Times New Roman"/>
+          <w:b w:val="0"/>
           <w:i/>
           <w:color w:val="000000"/>
           <w:sz w:val="26"/>
@@ -8526,6 +8634,7 @@
       <w:r>
         <w:rPr>
           <w:rFonts w:ascii="Times New Roman" w:hAnsi="Times New Roman"/>
+          <w:b w:val="0"/>
           <w:i/>
           <w:color w:val="000000"/>
           <w:sz w:val="26"/>
@@ -8545,6 +8654,7 @@
       <w:r>
         <w:rPr>
           <w:rFonts w:ascii="Times New Roman" w:hAnsi="Times New Roman"/>
+          <w:b w:val="0"/>
           <w:i/>
           <w:color w:val="000000"/>
           <w:sz w:val="26"/>
@@ -8564,6 +8674,7 @@
       <w:r>
         <w:rPr>
           <w:rFonts w:ascii="Times New Roman" w:hAnsi="Times New Roman"/>
+          <w:b w:val="0"/>
           <w:i/>
           <w:color w:val="000000"/>
           <w:sz w:val="26"/>
@@ -8583,6 +8694,7 @@
       <w:r>
         <w:rPr>
           <w:rFonts w:ascii="Times New Roman" w:hAnsi="Times New Roman"/>
+          <w:b w:val="0"/>
           <w:i/>
           <w:color w:val="000000"/>
           <w:sz w:val="26"/>
@@ -8645,6 +8757,7 @@
       <w:r>
         <w:rPr>
           <w:rFonts w:ascii="Times New Roman" w:hAnsi="Times New Roman"/>
+          <w:b w:val="0"/>
           <w:i/>
           <w:color w:val="000000"/>
           <w:sz w:val="26"/>
@@ -8664,6 +8777,7 @@
       <w:r>
         <w:rPr>
           <w:rFonts w:ascii="Times New Roman" w:hAnsi="Times New Roman"/>
+          <w:b w:val="0"/>
           <w:i/>
           <w:color w:val="000000"/>
           <w:sz w:val="26"/>
@@ -8915,6 +9029,7 @@
       <w:r>
         <w:rPr>
           <w:rFonts w:ascii="Times New Roman" w:hAnsi="Times New Roman"/>
+          <w:b w:val="0"/>
           <w:i/>
           <w:color w:val="000000"/>
           <w:sz w:val="26"/>
@@ -8969,6 +9084,7 @@
       <w:r>
         <w:rPr>
           <w:rFonts w:ascii="Times New Roman" w:hAnsi="Times New Roman"/>
+          <w:b w:val="0"/>
           <w:i/>
           <w:color w:val="000000"/>
           <w:sz w:val="26"/>
@@ -8988,6 +9104,7 @@
       <w:r>
         <w:rPr>
           <w:rFonts w:ascii="Times New Roman" w:hAnsi="Times New Roman"/>
+          <w:b w:val="0"/>
           <w:i/>
           <w:color w:val="000000"/>
           <w:sz w:val="26"/>
@@ -9077,6 +9194,7 @@
       <w:r>
         <w:rPr>
           <w:rFonts w:ascii="Times New Roman" w:hAnsi="Times New Roman"/>
+          <w:b w:val="0"/>
           <w:i/>
           <w:color w:val="000000"/>
           <w:sz w:val="26"/>
@@ -9096,6 +9214,7 @@
       <w:r>
         <w:rPr>
           <w:rFonts w:ascii="Times New Roman" w:hAnsi="Times New Roman"/>
+          <w:b w:val="0"/>
           <w:i/>
           <w:color w:val="000000"/>
           <w:sz w:val="26"/>
@@ -9150,6 +9269,7 @@
       <w:r>
         <w:rPr>
           <w:rFonts w:ascii="Times New Roman" w:hAnsi="Times New Roman"/>
+          <w:b w:val="0"/>
           <w:i/>
           <w:color w:val="000000"/>
           <w:sz w:val="26"/>
@@ -9204,6 +9324,7 @@
       <w:r>
         <w:rPr>
           <w:rFonts w:ascii="Times New Roman" w:hAnsi="Times New Roman"/>
+          <w:b w:val="0"/>
           <w:i/>
           <w:color w:val="000000"/>
           <w:sz w:val="26"/>
@@ -9223,6 +9344,7 @@
       <w:r>
         <w:rPr>
           <w:rFonts w:ascii="Times New Roman" w:hAnsi="Times New Roman"/>
+          <w:b w:val="0"/>
           <w:i/>
           <w:color w:val="000000"/>
           <w:sz w:val="26"/>
@@ -9277,6 +9399,7 @@
       <w:r>
         <w:rPr>
           <w:rFonts w:ascii="Times New Roman" w:hAnsi="Times New Roman"/>
+          <w:b w:val="0"/>
           <w:i/>
           <w:color w:val="000000"/>
           <w:sz w:val="26"/>
@@ -9331,6 +9454,7 @@
       <w:r>
         <w:rPr>
           <w:rFonts w:ascii="Times New Roman" w:hAnsi="Times New Roman"/>
+          <w:b w:val="0"/>
           <w:i/>
           <w:color w:val="000000"/>
           <w:sz w:val="26"/>
@@ -9350,6 +9474,7 @@
       <w:r>
         <w:rPr>
           <w:rFonts w:ascii="Times New Roman" w:hAnsi="Times New Roman"/>
+          <w:b w:val="0"/>
           <w:i/>
           <w:color w:val="000000"/>
           <w:sz w:val="26"/>
@@ -9369,6 +9494,7 @@
       <w:r>
         <w:rPr>
           <w:rFonts w:ascii="Times New Roman" w:hAnsi="Times New Roman"/>
+          <w:b w:val="0"/>
           <w:i/>
           <w:color w:val="000000"/>
           <w:sz w:val="26"/>
@@ -9423,6 +9549,7 @@
       <w:r>
         <w:rPr>
           <w:rFonts w:ascii="Times New Roman" w:hAnsi="Times New Roman"/>
+          <w:b w:val="0"/>
           <w:i/>
           <w:color w:val="000000"/>
           <w:sz w:val="26"/>
@@ -9442,6 +9569,7 @@
       <w:r>
         <w:rPr>
           <w:rFonts w:ascii="Times New Roman" w:hAnsi="Times New Roman"/>
+          <w:b w:val="0"/>
           <w:i/>
           <w:color w:val="000000"/>
           <w:sz w:val="26"/>
@@ -9461,6 +9589,7 @@
       <w:r>
         <w:rPr>
           <w:rFonts w:ascii="Times New Roman" w:hAnsi="Times New Roman"/>
+          <w:b w:val="0"/>
           <w:i/>
           <w:color w:val="000000"/>
           <w:sz w:val="26"/>
@@ -9515,6 +9644,7 @@
       <w:r>
         <w:rPr>
           <w:rFonts w:ascii="Times New Roman" w:hAnsi="Times New Roman"/>
+          <w:b w:val="0"/>
           <w:i/>
           <w:color w:val="000000"/>
           <w:sz w:val="26"/>
@@ -9534,6 +9664,7 @@
       <w:r>
         <w:rPr>
           <w:rFonts w:ascii="Times New Roman" w:hAnsi="Times New Roman"/>
+          <w:b w:val="0"/>
           <w:i/>
           <w:color w:val="000000"/>
           <w:sz w:val="26"/>
@@ -9588,6 +9719,7 @@
       <w:r>
         <w:rPr>
           <w:rFonts w:ascii="Times New Roman" w:hAnsi="Times New Roman"/>
+          <w:b w:val="0"/>
           <w:i/>
           <w:color w:val="000000"/>
           <w:sz w:val="26"/>
@@ -9677,6 +9809,7 @@
       <w:r>
         <w:rPr>
           <w:rFonts w:ascii="Times New Roman" w:hAnsi="Times New Roman"/>
+          <w:b w:val="0"/>
           <w:i/>
           <w:color w:val="000000"/>
           <w:sz w:val="26"/>
@@ -9731,6 +9864,7 @@
       <w:r>
         <w:rPr>
           <w:rFonts w:ascii="Times New Roman" w:hAnsi="Times New Roman"/>
+          <w:b w:val="0"/>
           <w:i/>
           <w:color w:val="000000"/>
           <w:sz w:val="26"/>
@@ -9750,6 +9884,7 @@
       <w:r>
         <w:rPr>
           <w:rFonts w:ascii="Times New Roman" w:hAnsi="Times New Roman"/>
+          <w:b w:val="0"/>
           <w:i/>
           <w:color w:val="000000"/>
           <w:sz w:val="26"/>
@@ -9862,6 +9997,7 @@
       <w:r>
         <w:rPr>
           <w:rFonts w:ascii="Times New Roman" w:hAnsi="Times New Roman"/>
+          <w:b w:val="0"/>
           <w:i/>
           <w:color w:val="000000"/>
           <w:sz w:val="26"/>
@@ -9906,6 +10042,7 @@
       <w:r>
         <w:rPr>
           <w:rFonts w:ascii="Times New Roman" w:hAnsi="Times New Roman"/>
+          <w:b w:val="0"/>
           <w:i/>
           <w:color w:val="000000"/>
           <w:sz w:val="26"/>
@@ -9950,6 +10087,7 @@
       <w:r>
         <w:rPr>
           <w:rFonts w:ascii="Times New Roman" w:hAnsi="Times New Roman"/>
+          <w:b w:val="0"/>
           <w:i/>
           <w:color w:val="000000"/>
           <w:sz w:val="26"/>
@@ -10069,6 +10207,7 @@
       <w:r>
         <w:rPr>
           <w:rFonts w:ascii="Times New Roman" w:hAnsi="Times New Roman"/>
+          <w:b w:val="0"/>
           <w:i/>
           <w:color w:val="000000"/>
           <w:sz w:val="26"/>
@@ -10163,6 +10302,7 @@
       <w:r>
         <w:rPr>
           <w:rFonts w:ascii="Times New Roman" w:hAnsi="Times New Roman"/>
+          <w:b w:val="0"/>
           <w:i/>
           <w:color w:val="000000"/>
           <w:sz w:val="26"/>
@@ -10207,6 +10347,7 @@
       <w:r>
         <w:rPr>
           <w:rFonts w:ascii="Times New Roman" w:hAnsi="Times New Roman"/>
+          <w:b w:val="0"/>
           <w:i/>
           <w:color w:val="000000"/>
           <w:sz w:val="26"/>
@@ -10251,6 +10392,7 @@
       <w:r>
         <w:rPr>
           <w:rFonts w:ascii="Times New Roman" w:hAnsi="Times New Roman"/>
+          <w:b w:val="0"/>
           <w:i/>
           <w:color w:val="000000"/>
           <w:sz w:val="26"/>
@@ -10370,6 +10512,7 @@
       <w:r>
         <w:rPr>
           <w:rFonts w:ascii="Times New Roman" w:hAnsi="Times New Roman"/>
+          <w:b w:val="0"/>
           <w:i/>
           <w:color w:val="000000"/>
           <w:sz w:val="26"/>
@@ -10414,6 +10557,7 @@
       <w:r>
         <w:rPr>
           <w:rFonts w:ascii="Times New Roman" w:hAnsi="Times New Roman"/>
+          <w:b w:val="0"/>
           <w:i/>
           <w:color w:val="000000"/>
           <w:sz w:val="26"/>
@@ -10458,6 +10602,7 @@
       <w:r>
         <w:rPr>
           <w:rFonts w:ascii="Times New Roman" w:hAnsi="Times New Roman"/>
+          <w:b w:val="0"/>
           <w:i/>
           <w:color w:val="000000"/>
           <w:sz w:val="26"/>
@@ -10477,6 +10622,7 @@
       <w:r>
         <w:rPr>
           <w:rFonts w:ascii="Times New Roman" w:hAnsi="Times New Roman"/>
+          <w:b w:val="0"/>
           <w:i/>
           <w:color w:val="000000"/>
           <w:sz w:val="26"/>
@@ -10549,6 +10695,7 @@
       <w:r>
         <w:rPr>
           <w:rFonts w:ascii="Times New Roman" w:hAnsi="Times New Roman"/>
+          <w:b w:val="0"/>
           <w:i/>
           <w:color w:val="000000"/>
           <w:sz w:val="26"/>
@@ -10603,6 +10750,7 @@
       <w:r>
         <w:rPr>
           <w:rFonts w:ascii="Times New Roman" w:hAnsi="Times New Roman"/>
+          <w:b w:val="0"/>
           <w:i/>
           <w:color w:val="000000"/>
           <w:sz w:val="26"/>
@@ -10622,6 +10770,7 @@
       <w:r>
         <w:rPr>
           <w:rFonts w:ascii="Times New Roman" w:hAnsi="Times New Roman"/>
+          <w:b w:val="0"/>
           <w:i/>
           <w:color w:val="000000"/>
           <w:sz w:val="26"/>
@@ -10641,6 +10790,7 @@
       <w:r>
         <w:rPr>
           <w:rFonts w:ascii="Times New Roman" w:hAnsi="Times New Roman"/>
+          <w:b w:val="0"/>
           <w:i/>
           <w:color w:val="000000"/>
           <w:sz w:val="26"/>
@@ -10695,6 +10845,7 @@
       <w:r>
         <w:rPr>
           <w:rFonts w:ascii="Times New Roman" w:hAnsi="Times New Roman"/>
+          <w:b w:val="0"/>
           <w:i/>
           <w:color w:val="000000"/>
           <w:sz w:val="26"/>
@@ -10749,6 +10900,7 @@
       <w:r>
         <w:rPr>
           <w:rFonts w:ascii="Times New Roman" w:hAnsi="Times New Roman"/>
+          <w:b w:val="0"/>
           <w:i/>
           <w:color w:val="000000"/>
           <w:sz w:val="26"/>
@@ -10768,6 +10920,7 @@
       <w:r>
         <w:rPr>
           <w:rFonts w:ascii="Times New Roman" w:hAnsi="Times New Roman"/>
+          <w:b w:val="0"/>
           <w:i/>
           <w:color w:val="000000"/>
           <w:sz w:val="26"/>
@@ -10787,6 +10940,7 @@
       <w:r>
         <w:rPr>
           <w:rFonts w:ascii="Times New Roman" w:hAnsi="Times New Roman"/>
+          <w:b w:val="0"/>
           <w:i/>
           <w:color w:val="000000"/>
           <w:sz w:val="26"/>
@@ -10841,6 +10995,7 @@
       <w:r>
         <w:rPr>
           <w:rFonts w:ascii="Times New Roman" w:hAnsi="Times New Roman"/>
+          <w:b w:val="0"/>
           <w:i/>
           <w:color w:val="000000"/>
           <w:sz w:val="26"/>
@@ -10895,6 +11050,7 @@
       <w:r>
         <w:rPr>
           <w:rFonts w:ascii="Times New Roman" w:hAnsi="Times New Roman"/>
+          <w:b w:val="0"/>
           <w:i/>
           <w:color w:val="000000"/>
           <w:sz w:val="26"/>
@@ -10914,6 +11070,7 @@
       <w:r>
         <w:rPr>
           <w:rFonts w:ascii="Times New Roman" w:hAnsi="Times New Roman"/>
+          <w:b w:val="0"/>
           <w:i/>
           <w:color w:val="000000"/>
           <w:sz w:val="26"/>
@@ -10933,6 +11090,7 @@
       <w:r>
         <w:rPr>
           <w:rFonts w:ascii="Times New Roman" w:hAnsi="Times New Roman"/>
+          <w:b w:val="0"/>
           <w:i/>
           <w:color w:val="000000"/>
           <w:sz w:val="26"/>
@@ -10952,6 +11110,7 @@
       <w:r>
         <w:rPr>
           <w:rFonts w:ascii="Times New Roman" w:hAnsi="Times New Roman"/>
+          <w:b w:val="0"/>
           <w:i/>
           <w:color w:val="000000"/>
           <w:sz w:val="26"/>

</xml_diff>